<commit_message>
reestructura: desacoplar el motor (genérico) del caso hígado
- motor/          <- método reusable (spec v3.1 + adenda v3.3 + "cómo ejecutar" + spec v3)
- casos/higado-mx/<- toda la ejecución del hígado (v3.1/* + DOC/FASE/CONSOLIDADO de raíz -> v3-superado/)
- material-fuente/<- prompts EAM/Evolve
- raíz limpia: README, HANDOFF (reescritos a v4.0 genérico), spec v4.0, scripts/, TrendTrack
El hígado deja de ser la identidad del motor; queda como caso de referencia histórico.

Co-Authored-By: Claude Opus 4.8 <noreply@anthropic.com>
</commit_message>
<xml_diff>
--- a/HANDOFF.docx
+++ b/HANDOFF.docx
@@ -7,7 +7,7 @@
         <w:pStyle w:val="Heading1"/>
       </w:pPr>
       <w:r>
-        <w:t>HANDOFF — Motor de Research DTC v3.3 + Proyecto Hígado MX</w:t>
+        <w:t>HANDOFF — Motor de Research DTC v4.0</w:t>
       </w:r>
     </w:p>
     <w:p>
@@ -18,7 +18,7 @@
         <w:rPr>
           <w:i/>
         </w:rPr>
-        <w:t>Documento de traspaso. Explica qué es este repo, qué se construyó, dónde está cada cosa y cómo continuar.</w:t>
+        <w:t>Traspaso del repo: qué es, dónde está cada cosa y cómo continuar.</w:t>
       </w:r>
     </w:p>
     <w:p>
@@ -30,13 +30,53 @@
           <w:b/>
           <w:i/>
         </w:rPr>
-        <w:t>Estado: Motor v3.3 · Proyecto hígado con research v3.2 (post-contraste) completo.</w:t>
+        <w:t>Estado: Motor v4.0</w:t>
       </w:r>
       <w:r>
         <w:rPr>
           <w:i/>
         </w:rPr>
-        <w:t xml:space="preserve"> Última actualización: 2026-07-05.</w:t>
+        <w:t xml:space="preserve"> (fusión v3.3 + Master Skill Research), ejecutable como skill </w:t>
+      </w:r>
+      <w:r>
+        <w:rPr>
+          <w:rFonts w:ascii="Consolas" w:hAnsi="Consolas"/>
+          <w:i/>
+          <w:color w:val="C03030"/>
+        </w:rPr>
+        <w:t>/voc-research</w:t>
+      </w:r>
+      <w:r>
+        <w:rPr>
+          <w:i/>
+        </w:rPr>
+        <w:t xml:space="preserve">. El </w:t>
+      </w:r>
+      <w:r>
+        <w:rPr>
+          <w:b/>
+          <w:i/>
+        </w:rPr>
+        <w:t>hígado MX</w:t>
+      </w:r>
+      <w:r>
+        <w:rPr>
+          <w:i/>
+        </w:rPr>
+        <w:t xml:space="preserve"> es un </w:t>
+      </w:r>
+      <w:r>
+        <w:rPr>
+          <w:b/>
+          <w:i/>
+        </w:rPr>
+        <w:t>caso de referencia histórico</w:t>
+      </w:r>
+      <w:r>
+        <w:rPr>
+          <w:i/>
+        </w:rPr>
+        <w:t>, no el motor.</w:t>
       </w:r>
     </w:p>
     <w:p>
@@ -49,103 +89,57 @@
     </w:p>
     <w:p>
       <w:r>
-        <w:t>Dos cosas conviven aquí:</w:t>
-      </w:r>
-    </w:p>
-    <w:p>
-      <w:pPr>
-        <w:pStyle w:val="ListNumber"/>
-      </w:pPr>
-      <w:r>
-        <w:rPr>
-          <w:b/>
-        </w:rPr>
-        <w:t>El MOTOR DE RESEARCH v3.3</w:t>
-      </w:r>
-      <w:r>
-        <w:t xml:space="preserve"> — una máquina </w:t>
+        <w:t xml:space="preserve">El </w:t>
       </w:r>
       <w:r>
         <w:rPr>
           <w:b/>
         </w:rPr>
-        <w:t>repetible, auditable y auto-correctiva</w:t>
+        <w:t>Motor de Research DTC</w:t>
       </w:r>
       <w:r>
-        <w:t xml:space="preserve"> para investigación pre-lanzamiento de productos DTC (ads Meta/TikTok, metodología Eugene Schwartz). Va desde "¿qué desea el mercado?" hasta hooks listos para pauta, con evidencia trazable por IDs.</w:t>
-      </w:r>
-    </w:p>
-    <w:p>
-      <w:pPr>
-        <w:pStyle w:val="ListNumber"/>
-      </w:pPr>
-      <w:r>
-        <w:rPr>
-          <w:b/>
-        </w:rPr>
-        <w:t>El primer producto ejecutado con el motor</w:t>
-      </w:r>
-      <w:r>
-        <w:t xml:space="preserve"> — un suplemento de salud hepática (base competidor </w:t>
+        <w:t xml:space="preserve">: máquina </w:t>
       </w:r>
       <w:r>
         <w:rPr>
           <w:b/>
         </w:rPr>
-        <w:t>Purelia</w:t>
+        <w:t>repetible, auditable, auto-correctiva y product-agnostic</w:t>
       </w:r>
       <w:r>
-        <w:t xml:space="preserve">) para lanzar en </w:t>
+        <w:t xml:space="preserve"> de research VoC pre-lanzamiento (ads Meta/TikTok, metodología Schwartz). Va de "¿qué desea el mercado?" hasta el veredicto estratégico (Master Spine), con evidencia trazable por IDs. Es la </w:t>
       </w:r>
       <w:r>
         <w:rPr>
           <w:b/>
         </w:rPr>
-        <w:t>México</w:t>
+        <w:t>ETAPA 1</w:t>
       </w:r>
       <w:r>
-        <w:t xml:space="preserve">, ampliado a salud intestinal. Es el </w:t>
+        <w:t xml:space="preserve"> de un pipeline de 4: </w:t>
       </w:r>
       <w:r>
         <w:rPr>
           <w:b/>
         </w:rPr>
-        <w:t>caso de referencia</w:t>
+        <w:t>Research → Creativos → Media Buying → Feedback</w:t>
       </w:r>
       <w:r>
-        <w:t xml:space="preserve"> que prueba el motor.</w:t>
+        <w:t>.</w:t>
       </w:r>
     </w:p>
     <w:p>
       <w:r>
-        <w:t>Origen: fusión de dos sistemas previos del negocio (</w:t>
+        <w:t xml:space="preserve">Origen: fusión de sistemas previos del negocio (Desire-To-Scale 2.0, Evolve/EAM) + Playbook VoC → v3.1 (auditable) → v3.3 (doble vía) → </w:t>
       </w:r>
       <w:r>
         <w:rPr>
           <w:b/>
         </w:rPr>
-        <w:t>Desire-To-Scale 2.0</w:t>
+        <w:t>v4.0</w:t>
       </w:r>
       <w:r>
-        <w:t xml:space="preserve"> y </w:t>
-      </w:r>
-      <w:r>
-        <w:rPr>
-          <w:b/>
-        </w:rPr>
-        <w:t>Evolve/EAM</w:t>
-      </w:r>
-      <w:r>
-        <w:t xml:space="preserve">) + un </w:t>
-      </w:r>
-      <w:r>
-        <w:rPr>
-          <w:b/>
-        </w:rPr>
-        <w:t>Playbook VoC</w:t>
-      </w:r>
-      <w:r>
-        <w:t xml:space="preserve"> con scraping real, refinado a v3.1 (auditable) y v3.3 (doble vía obligatoria).</w:t>
+        <w:t xml:space="preserve"> (fusión con el sistema Master Skill Research: adquisición autónoma, cobertura 100%, anti-fabricación mecánica, avatares Evolve, canal 0).</w:t>
       </w:r>
     </w:p>
     <w:p>
@@ -153,15 +147,119 @@
         <w:pStyle w:val="Heading2"/>
       </w:pPr>
       <w:r>
-        <w:t>2. LA REGLA NÚCLEO del motor (v3.3) — léela primero</w:t>
+        <w:t>2. Autoridad y ejecución</w:t>
+      </w:r>
+    </w:p>
+    <w:p>
+      <w:pPr>
+        <w:pStyle w:val="ListBullet"/>
+      </w:pPr>
+      <w:r>
+        <w:rPr>
+          <w:b/>
+        </w:rPr>
+        <w:t>Autoridad de diseño (vigente):</w:t>
+      </w:r>
+      <w:r>
+        <w:t xml:space="preserve"> </w:t>
+      </w:r>
+      <w:r>
+        <w:rPr>
+          <w:rFonts w:ascii="Consolas" w:hAnsi="Consolas"/>
+          <w:color w:val="C03030"/>
+        </w:rPr>
+        <w:t>MOTOR DE RESEARCH v4.0 — Spec Operativo.md</w:t>
+      </w:r>
+      <w:r>
+        <w:t xml:space="preserve"> (raíz) — mapa de docs 00/14-21/B0/B1/10, pipeline F0-F6.</w:t>
+      </w:r>
+    </w:p>
+    <w:p>
+      <w:pPr>
+        <w:pStyle w:val="ListBullet"/>
+      </w:pPr>
+      <w:r>
+        <w:rPr>
+          <w:b/>
+        </w:rPr>
+        <w:t>Ejecución:</w:t>
+      </w:r>
+      <w:r>
+        <w:t xml:space="preserve"> skill </w:t>
+      </w:r>
+      <w:r>
+        <w:rPr>
+          <w:b/>
+        </w:rPr>
+        <w:t>`/voc-research`</w:t>
+      </w:r>
+      <w:r>
+        <w:t xml:space="preserve"> (nivel usuario, </w:t>
+      </w:r>
+      <w:r>
+        <w:rPr>
+          <w:rFonts w:ascii="Consolas" w:hAnsi="Consolas"/>
+          <w:color w:val="C03030"/>
+        </w:rPr>
+        <w:t>~/.claude/skills/voc-research/</w:t>
+      </w:r>
+      <w:r>
+        <w:t xml:space="preserve">, </w:t>
+      </w:r>
+      <w:r>
+        <w:rPr>
+          <w:b/>
+        </w:rPr>
+        <w:t>fuera del repo</w:t>
+      </w:r>
+      <w:r>
+        <w:t>).</w:t>
+      </w:r>
+    </w:p>
+    <w:p>
+      <w:pPr>
+        <w:pStyle w:val="ListBullet"/>
+      </w:pPr>
+      <w:r>
+        <w:rPr>
+          <w:b/>
+        </w:rPr>
+        <w:t>Método / linaje:</w:t>
+      </w:r>
+      <w:r>
+        <w:t xml:space="preserve"> </w:t>
+      </w:r>
+      <w:r>
+        <w:rPr>
+          <w:rFonts w:ascii="Consolas" w:hAnsi="Consolas"/>
+          <w:color w:val="C03030"/>
+        </w:rPr>
+        <w:t>motor/</w:t>
+      </w:r>
+      <w:r>
+        <w:t xml:space="preserve"> (spec v3.1 + adenda v3.3 + "cómo ejecutar en otro producto" + spec v3).</w:t>
+      </w:r>
+    </w:p>
+    <w:p>
+      <w:pPr>
+        <w:pStyle w:val="Heading2"/>
+      </w:pPr>
+      <w:r>
+        <w:t>3. LA REGLA NÚCLEO (se conserva de v3.3)</w:t>
       </w:r>
     </w:p>
     <w:p>
       <w:r>
+        <w:t xml:space="preserve">Todo research combina </w:t>
+      </w:r>
+      <w:r>
         <w:rPr>
           <w:b/>
         </w:rPr>
-        <w:t>Todo research combina DOS VÍAS y cierra el loop. No es opcional.</w:t>
+        <w:t>DOS VÍAS</w:t>
+      </w:r>
+      <w:r>
+        <w:t xml:space="preserve"> y cierra el loop:</w:t>
       </w:r>
     </w:p>
     <w:p>
@@ -175,7 +273,7 @@
         <w:t>Vía A — Deep research</w:t>
       </w:r>
       <w:r>
-        <w:t xml:space="preserve"> (web/desk, con fuentes/URLs) → hipótesis fundamentadas externas.</w:t>
+        <w:t xml:space="preserve"> (web/desk, con fuentes/URLs) → hipótesis fundamentadas.</w:t>
       </w:r>
     </w:p>
     <w:p>
@@ -186,10 +284,10 @@
         <w:rPr>
           <w:b/>
         </w:rPr>
-        <w:t>Vía B — Scraping VoC</w:t>
+        <w:t>Vía B — Corpus VoC</w:t>
       </w:r>
       <w:r>
-        <w:t xml:space="preserve"> del corpus real completo (con IDs </w:t>
+        <w:t xml:space="preserve"> completo (con IDs </w:t>
       </w:r>
       <w:r>
         <w:rPr>
@@ -213,7 +311,7 @@
         <w:t>Contraste</w:t>
       </w:r>
       <w:r>
-        <w:t xml:space="preserve"> — documento por elemento: </w:t>
+        <w:t xml:space="preserve"> por elemento: </w:t>
       </w:r>
       <w:r>
         <w:rPr>
@@ -236,341 +334,9 @@
         <w:t>Regla soberana: donde B contradice a A, manda B.</w:t>
       </w:r>
       <w:r>
-        <w:t xml:space="preserve"> El Spine se reconcilia AL FINAL.</w:t>
+        <w:t xml:space="preserve"> El Master Spine (doc 00) se reconcilia AL FINAL.</w:t>
       </w:r>
     </w:p>
-    <w:p>
-      <w:r>
-        <w:t xml:space="preserve">Detalle en </w:t>
-      </w:r>
-      <w:r>
-        <w:rPr>
-          <w:rFonts w:ascii="Consolas" w:hAnsi="Consolas"/>
-          <w:color w:val="C03030"/>
-        </w:rPr>
-        <w:t>v3.1/MOTOR DE RESEARCH v3.3 — Adenda Doble Vía.md</w:t>
-      </w:r>
-      <w:r>
-        <w:t>.</w:t>
-      </w:r>
-    </w:p>
-    <w:p>
-      <w:pPr>
-        <w:pStyle w:val="Heading2"/>
-      </w:pPr>
-      <w:r>
-        <w:t>3. Estado actual (qué está hecho)</w:t>
-      </w:r>
-    </w:p>
-    <w:tbl>
-      <w:tblPr>
-        <w:tblStyle w:val="LightGrid-Accent1"/>
-        <w:tblW w:type="auto" w:w="0"/>
-        <w:tblLook w:firstColumn="1" w:firstRow="1" w:lastColumn="0" w:lastRow="0" w:noHBand="0" w:noVBand="1" w:val="04A0"/>
-      </w:tblPr>
-      <w:tblGrid>
-        <w:gridCol w:w="4320"/>
-        <w:gridCol w:w="4320"/>
-      </w:tblGrid>
-      <w:tr>
-        <w:tc>
-          <w:tcPr>
-            <w:tcW w:type="dxa" w:w="4320"/>
-          </w:tcPr>
-          <w:p>
-            <w:r>
-              <w:rPr>
-                <w:b/>
-              </w:rPr>
-              <w:t>Bloque</w:t>
-            </w:r>
-          </w:p>
-        </w:tc>
-        <w:tc>
-          <w:tcPr>
-            <w:tcW w:type="dxa" w:w="4320"/>
-          </w:tcPr>
-          <w:p>
-            <w:r>
-              <w:rPr>
-                <w:b/>
-              </w:rPr>
-              <w:t>Estado</w:t>
-            </w:r>
-          </w:p>
-        </w:tc>
-      </w:tr>
-      <w:tr>
-        <w:tc>
-          <w:tcPr>
-            <w:tcW w:type="dxa" w:w="4320"/>
-          </w:tcPr>
-          <w:p>
-            <w:r>
-              <w:t>Motor v3.1 (auditable: fuentes, IDs, PI transparente, validadores)</w:t>
-            </w:r>
-          </w:p>
-        </w:tc>
-        <w:tc>
-          <w:tcPr>
-            <w:tcW w:type="dxa" w:w="4320"/>
-          </w:tcPr>
-          <w:p>
-            <w:r>
-              <w:t>✅</w:t>
-            </w:r>
-          </w:p>
-        </w:tc>
-      </w:tr>
-      <w:tr>
-        <w:tc>
-          <w:tcPr>
-            <w:tcW w:type="dxa" w:w="4320"/>
-          </w:tcPr>
-          <w:p>
-            <w:r>
-              <w:rPr>
-                <w:b/>
-              </w:rPr>
-              <w:t>Motor v3.3 (doble vía + contraste obligatorios)</w:t>
-            </w:r>
-          </w:p>
-        </w:tc>
-        <w:tc>
-          <w:tcPr>
-            <w:tcW w:type="dxa" w:w="4320"/>
-          </w:tcPr>
-          <w:p>
-            <w:r>
-              <w:t>✅ adenda</w:t>
-            </w:r>
-          </w:p>
-        </w:tc>
-      </w:tr>
-      <w:tr>
-        <w:tc>
-          <w:tcPr>
-            <w:tcW w:type="dxa" w:w="4320"/>
-          </w:tcPr>
-          <w:p>
-            <w:r>
-              <w:t>Corpus real escrapeado</w:t>
-            </w:r>
-          </w:p>
-        </w:tc>
-        <w:tc>
-          <w:tcPr>
-            <w:tcW w:type="dxa" w:w="4320"/>
-          </w:tcPr>
-          <w:p>
-            <w:r>
-              <w:t xml:space="preserve">✅ </w:t>
-            </w:r>
-            <w:r>
-              <w:rPr>
-                <w:b/>
-              </w:rPr>
-              <w:t>13,548 confesiones</w:t>
-            </w:r>
-            <w:r>
-              <w:t xml:space="preserve"> (</w:t>
-            </w:r>
-            <w:r>
-              <w:rPr>
-                <w:rFonts w:ascii="Consolas" w:hAnsi="Consolas"/>
-                <w:color w:val="C03030"/>
-              </w:rPr>
-              <w:t>v3.1/evidence_bank.csv</w:t>
-            </w:r>
-            <w:r>
-              <w:t>)</w:t>
-            </w:r>
-          </w:p>
-        </w:tc>
-      </w:tr>
-      <w:tr>
-        <w:tc>
-          <w:tcPr>
-            <w:tcW w:type="dxa" w:w="4320"/>
-          </w:tcPr>
-          <w:p>
-            <w:r>
-              <w:t>Docs de research v3 (avatar, psych, UMP, hooks, spine)</w:t>
-            </w:r>
-          </w:p>
-        </w:tc>
-        <w:tc>
-          <w:tcPr>
-            <w:tcW w:type="dxa" w:w="4320"/>
-          </w:tcPr>
-          <w:p>
-            <w:r>
-              <w:t>✅ (superados por los "b")</w:t>
-            </w:r>
-          </w:p>
-        </w:tc>
-      </w:tr>
-      <w:tr>
-        <w:tc>
-          <w:tcPr>
-            <w:tcW w:type="dxa" w:w="4320"/>
-          </w:tcPr>
-          <w:p>
-            <w:r>
-              <w:rPr>
-                <w:b/>
-              </w:rPr>
-              <w:t>Docs de CONTRASTE v3.2</w:t>
-            </w:r>
-            <w:r>
-              <w:t xml:space="preserve"> (15b, 18b, 19b, 20b, COMPETITOR_MAP b)</w:t>
-            </w:r>
-          </w:p>
-        </w:tc>
-        <w:tc>
-          <w:tcPr>
-            <w:tcW w:type="dxa" w:w="4320"/>
-          </w:tcPr>
-          <w:p>
-            <w:r>
-              <w:t>✅ ~164 citas ID, ~173 veredictos</w:t>
-            </w:r>
-          </w:p>
-        </w:tc>
-      </w:tr>
-      <w:tr>
-        <w:tc>
-          <w:tcPr>
-            <w:tcW w:type="dxa" w:w="4320"/>
-          </w:tcPr>
-          <w:p>
-            <w:r>
-              <w:rPr>
-                <w:b/>
-              </w:rPr>
-              <w:t>Spine v3.2 (post-contraste)</w:t>
-            </w:r>
-            <w:r>
-              <w:t xml:space="preserve"> con changelog de 14 cambios</w:t>
-            </w:r>
-          </w:p>
-        </w:tc>
-        <w:tc>
-          <w:tcPr>
-            <w:tcW w:type="dxa" w:w="4320"/>
-          </w:tcPr>
-          <w:p>
-            <w:r>
-              <w:t>✅</w:t>
-            </w:r>
-          </w:p>
-        </w:tc>
-      </w:tr>
-      <w:tr>
-        <w:tc>
-          <w:tcPr>
-            <w:tcW w:type="dxa" w:w="4320"/>
-          </w:tcPr>
-          <w:p>
-            <w:r>
-              <w:rPr>
-                <w:b/>
-              </w:rPr>
-              <w:t>Hooks v3.2</w:t>
-            </w:r>
-            <w:r>
-              <w:t xml:space="preserve"> (DOC 21b, alineados al frame corregido)</w:t>
-            </w:r>
-          </w:p>
-        </w:tc>
-        <w:tc>
-          <w:tcPr>
-            <w:tcW w:type="dxa" w:w="4320"/>
-          </w:tcPr>
-          <w:p>
-            <w:r>
-              <w:t>✅ 36 hooks</w:t>
-            </w:r>
-          </w:p>
-        </w:tc>
-      </w:tr>
-      <w:tr>
-        <w:tc>
-          <w:tcPr>
-            <w:tcW w:type="dxa" w:w="4320"/>
-          </w:tcPr>
-          <w:p>
-            <w:r>
-              <w:t>Consolidado Excel (tier lists + Hooks v3.2)</w:t>
-            </w:r>
-          </w:p>
-        </w:tc>
-        <w:tc>
-          <w:tcPr>
-            <w:tcW w:type="dxa" w:w="4320"/>
-          </w:tcPr>
-          <w:p>
-            <w:r>
-              <w:t>✅</w:t>
-            </w:r>
-          </w:p>
-        </w:tc>
-      </w:tr>
-      <w:tr>
-        <w:tc>
-          <w:tcPr>
-            <w:tcW w:type="dxa" w:w="4320"/>
-          </w:tcPr>
-          <w:p>
-            <w:r>
-              <w:t>Todo a Word</w:t>
-            </w:r>
-          </w:p>
-        </w:tc>
-        <w:tc>
-          <w:tcPr>
-            <w:tcW w:type="dxa" w:w="4320"/>
-          </w:tcPr>
-          <w:p>
-            <w:r>
-              <w:t>✅</w:t>
-            </w:r>
-          </w:p>
-        </w:tc>
-      </w:tr>
-      <w:tr>
-        <w:tc>
-          <w:tcPr>
-            <w:tcW w:type="dxa" w:w="4320"/>
-          </w:tcPr>
-          <w:p>
-            <w:r>
-              <w:t>Validación</w:t>
-            </w:r>
-          </w:p>
-        </w:tc>
-        <w:tc>
-          <w:tcPr>
-            <w:tcW w:type="dxa" w:w="4320"/>
-          </w:tcPr>
-          <w:p>
-            <w:r>
-              <w:t xml:space="preserve">✅ </w:t>
-            </w:r>
-            <w:r>
-              <w:rPr>
-                <w:b/>
-              </w:rPr>
-              <w:t>APROBADO</w:t>
-            </w:r>
-            <w:r>
-              <w:t xml:space="preserve"> (0 residuales, 0 IDs colgantes)</w:t>
-            </w:r>
-          </w:p>
-        </w:tc>
-      </w:tr>
-    </w:tbl>
-    <w:p/>
     <w:p>
       <w:pPr>
         <w:pStyle w:val="Heading2"/>
@@ -590,152 +356,62 @@
     </w:p>
     <w:p>
       <w:r>
-        <w:t>DOCUMENTOS DE INVESTIGACIÓN/</w:t>
+        <w:t>motor-research-dtc/</w:t>
       </w:r>
     </w:p>
     <w:p>
       <w:r>
-        <w:t>├── HANDOFF.md · README.md                       ← empieza aquí</w:t>
+        <w:t>├── README.md · HANDOFF.md                       ← empieza aquí</w:t>
       </w:r>
     </w:p>
     <w:p>
       <w:r>
-        <w:t>├── MOTOR DE RESEARCH v3 — Spec Operativo.md      ← spec conceptual original</w:t>
+        <w:t>├── MOTOR DE RESEARCH v4.0 — Spec Operativo.md    ← autoridad vigente del motor</w:t>
       </w:r>
     </w:p>
     <w:p>
       <w:r>
-        <w:t>├── CONSOLIDADO — Research Hígado MX.xlsx         ← resumen ejecutivo (8 pestañas, incl. Hooks v3.2)</w:t>
+        <w:t>├── motor/            ← el método reusable (spec v3.1 + adenda v3.3 + "cómo ejecutar" + spec v3)</w:t>
       </w:r>
     </w:p>
     <w:p>
       <w:r>
-        <w:t>│</w:t>
+        <w:t>├── scripts/          ← ejecutables (v31_foundation, v31_docs, validate_v31, md2docx, build_xlsx)</w:t>
       </w:r>
     </w:p>
     <w:p>
       <w:r>
-        <w:t>├── FASE 0 · DOC 00/15/16/19/20/21 (.md + .docx)  ← research v3 (SUPERADO por los "b")</w:t>
+        <w:t>├── material-fuente/  ← prompts fuente EAM/Evolve que el motor fusionó</w:t>
       </w:r>
     </w:p>
     <w:p>
       <w:r>
-        <w:t>├── scripts/                                      ← el motor ejecutable</w:t>
+        <w:t>├── casos/</w:t>
       </w:r>
     </w:p>
     <w:p>
       <w:r>
-        <w:t>│   ├── v31_foundation.py  (ingesta + jerarquía de fuentes + PI transparente)</w:t>
+        <w:t>│   └── higado-mx/    ← 1er producto corrido (EJEMPLO, no el motor)</w:t>
       </w:r>
     </w:p>
     <w:p>
       <w:r>
-        <w:t>│   ├── v31_docs.py        (DATA QUALITY / CLUSTER_REPORT / DOC 14)</w:t>
+        <w:t>│       ├── DOC 00 Spine v3.2 · DOC 14/15b/18b/19b/20b · DOC 21b hooks · COMPETITOR_MAP b</w:t>
       </w:r>
     </w:p>
     <w:p>
       <w:r>
-        <w:t>│   ├── validate_v31.py    (validadores → VALIDATION REPORT)</w:t>
+        <w:t>│       ├── evidence_bank.csv (13,548 IDs) · PI_SCORES · reports · briefs/ · research/ · voc_banks/</w:t>
       </w:r>
     </w:p>
     <w:p>
       <w:r>
-        <w:t>│   ├── md2docx.py · build_xlsx.py</w:t>
+        <w:t>│       └── v3-superado/  ← docs v3 previos al contraste (FASE 0, DOC 00/15/16/19/20/21) + CONSOLIDADO</w:t>
       </w:r>
     </w:p>
     <w:p>
       <w:r>
-        <w:t>│</w:t>
-      </w:r>
-    </w:p>
-    <w:p>
-      <w:r>
-        <w:t>├── 1)..7) *.docx/.txt                            ← material fuente (prompts Evolve/EAM)</w:t>
-      </w:r>
-    </w:p>
-    <w:p>
-      <w:r>
-        <w:t>│</w:t>
-      </w:r>
-    </w:p>
-    <w:p>
-      <w:r>
-        <w:t>└── v3.1/  ← EL MOTOR AUDITABLE + LA CAPA DE CONTRASTE v3.2 (todo con .docx)</w:t>
-      </w:r>
-    </w:p>
-    <w:p>
-      <w:r>
-        <w:t xml:space="preserve">    ├── MOTOR DE RESEARCH v3.1 — Spec Operativo.md</w:t>
-      </w:r>
-    </w:p>
-    <w:p>
-      <w:r>
-        <w:t xml:space="preserve">    ├── MOTOR DE RESEARCH v3.3 — Adenda Doble Vía.md      ← la regla núcleo v3.3</w:t>
-      </w:r>
-    </w:p>
-    <w:p>
-      <w:r>
-        <w:t xml:space="preserve">    ├── README — Cómo ejecutar este motor en otro producto.md</w:t>
-      </w:r>
-    </w:p>
-    <w:p>
-      <w:r>
-        <w:t xml:space="preserve">    ├── DATA QUALITY REPORT.md · VALIDATION REPORT.md</w:t>
-      </w:r>
-    </w:p>
-    <w:p>
-      <w:r>
-        <w:t xml:space="preserve">    ├── DOC 14 — Banco de Evidencia Canónico.md + evidence_bank.csv (13,548 IDs)</w:t>
-      </w:r>
-    </w:p>
-    <w:p>
-      <w:r>
-        <w:t xml:space="preserve">    ├── PI_SCORES.csv · CLUSTER_REPORT.md</w:t>
-      </w:r>
-    </w:p>
-    <w:p>
-      <w:r>
-        <w:t xml:space="preserve">    ├── COMPETITOR_MAP.md · RECONCILIATION PASS.md</w:t>
-      </w:r>
-    </w:p>
-    <w:p>
-      <w:r>
-        <w:t xml:space="preserve">    ├── DOC 00 — Master Spine actualizado.md              (v3.1)</w:t>
-      </w:r>
-    </w:p>
-    <w:p>
-      <w:r>
-        <w:t xml:space="preserve">    ├── ─────────── CAPA DE CONTRASTE v3.2 ───────────</w:t>
-      </w:r>
-    </w:p>
-    <w:p>
-      <w:r>
-        <w:t xml:space="preserve">    ├── DOC 15b — Avatar · DOC 18b — Deseos · DOC 19b — Mecanismo</w:t>
-      </w:r>
-    </w:p>
-    <w:p>
-      <w:r>
-        <w:t xml:space="preserve">    ├── DOC 20b — Buyer Psychology · COMPETITOR_MAP b     (Deep Research × VoC)</w:t>
-      </w:r>
-    </w:p>
-    <w:p>
-      <w:r>
-        <w:t xml:space="preserve">    ├── DOC 00 — Master Spine v3.2 (post-contraste).md    ← EL VERDICTO VIGENTE</w:t>
-      </w:r>
-    </w:p>
-    <w:p>
-      <w:r>
-        <w:t xml:space="preserve">    ├── DOC 21b — Banco de Hooks v3.2.md                  ← hooks para producción</w:t>
-      </w:r>
-    </w:p>
-    <w:p>
-      <w:r>
-        <w:t xml:space="preserve">    ├── voc_banks/     (bancos VoC por elemento, 90 citas c/u)</w:t>
-      </w:r>
-    </w:p>
-    <w:p>
-      <w:r>
-        <w:t xml:space="preserve">    └── research/      (Vía A con fuentes + Vía B por elemento)</w:t>
+        <w:t>└── RESEARCH DE PRODUCTOS EN TRENDTRACK/  ← product-hunting (research aparte, no hígado)</w:t>
       </w:r>
     </w:p>
     <w:p>
@@ -752,21 +428,71 @@
         <w:pStyle w:val="Heading2"/>
       </w:pPr>
       <w:r>
-        <w:t>5. El veredicto estratégico VIGENTE (Spine v3.2 — corregido por el contraste)</w:t>
+        <w:t>5. Salida → Creativos (encadenamiento)</w:t>
       </w:r>
     </w:p>
     <w:p>
       <w:r>
-        <w:t xml:space="preserve">⚠️ </w:t>
+        <w:t xml:space="preserve">El research entrega el </w:t>
       </w:r>
       <w:r>
         <w:rPr>
           <w:b/>
         </w:rPr>
-        <w:t>El frame v3 (gancho de hinchazón estética) fue REFUTADO por la voz real.</w:t>
+        <w:t>Master Spine (doc 00)</w:t>
       </w:r>
       <w:r>
-        <w:t xml:space="preserve"> El veredicto vigente es el v3.2:</w:t>
+        <w:t xml:space="preserve">. La skill </w:t>
+      </w:r>
+      <w:r>
+        <w:rPr>
+          <w:b/>
+        </w:rPr>
+        <w:t>`/master-spine`</w:t>
+      </w:r>
+      <w:r>
+        <w:t xml:space="preserve"> lo consolida y emite un </w:t>
+      </w:r>
+      <w:r>
+        <w:rPr>
+          <w:b/>
+        </w:rPr>
+        <w:t>`spine.json`</w:t>
+      </w:r>
+      <w:r>
+        <w:t xml:space="preserve"> que consume el </w:t>
+      </w:r>
+      <w:r>
+        <w:rPr>
+          <w:b/>
+        </w:rPr>
+        <w:t>Motor de Creativos</w:t>
+      </w:r>
+      <w:r>
+        <w:t xml:space="preserve"> (repo </w:t>
+      </w:r>
+      <w:r>
+        <w:rPr>
+          <w:rFonts w:ascii="Consolas" w:hAnsi="Consolas"/>
+          <w:color w:val="C03030"/>
+        </w:rPr>
+        <w:t>motor-creativos-dtc</w:t>
+      </w:r>
+      <w:r>
+        <w:t>). Así el veredicto de research alimenta directo la generación de baches/creativos.</w:t>
+      </w:r>
+    </w:p>
+    <w:p>
+      <w:pPr>
+        <w:pStyle w:val="Heading2"/>
+      </w:pPr>
+      <w:r>
+        <w:t>6. Caso de referencia — Hígado MX (casos/higado-mx/, histórico, NO es el motor)</w:t>
+      </w:r>
+    </w:p>
+    <w:p>
+      <w:r>
+        <w:t>Primer producto corrido (research v3.2 post-contraste). Veredicto vigente de ESE caso:</w:t>
       </w:r>
     </w:p>
     <w:p>
@@ -780,16 +506,7 @@
         <w:t>Avatar núcleo:</w:t>
       </w:r>
       <w:r>
-        <w:t xml:space="preserve"> </w:t>
-      </w:r>
-      <w:r>
-        <w:rPr>
-          <w:b/>
-        </w:rPr>
-        <w:t>madre creyente mexicana 45-65 recién diagnosticada de hígado graso, aterrada de MORIR</w:t>
-      </w:r>
-      <w:r>
-        <w:t xml:space="preserve"> (vio morir a alguien de esto). *No* la "mujer 40+ hinchada estética" (esa vive en ~4 citas → cabeza de playa para tráfico frío, a validar).</w:t>
+        <w:t xml:space="preserve"> madre creyente mexicana 45-65 recién diagnosticada de hígado graso, aterrada de MORIR. *No* la "hinchada estética 40+" (~4 citas → cabeza de playa a validar).</w:t>
       </w:r>
     </w:p>
     <w:p>
@@ -803,25 +520,16 @@
         <w:t>Gancho:</w:t>
       </w:r>
       <w:r>
-        <w:t xml:space="preserve"> el </w:t>
+        <w:t xml:space="preserve"> terror del diagnóstico + "revertirlo natural, sin cirugía ni pastillas". </w:t>
       </w:r>
       <w:r>
         <w:rPr>
           <w:b/>
         </w:rPr>
-        <w:t>terror del diagnóstico</w:t>
+        <w:t>Emoción:</w:t>
       </w:r>
       <w:r>
-        <w:t xml:space="preserve"> + </w:t>
-      </w:r>
-      <w:r>
-        <w:rPr>
-          <w:b/>
-        </w:rPr>
-        <w:t>"revertirlo por vía natural, sin cirugía ni pastillas de por vida"</w:t>
-      </w:r>
-      <w:r>
-        <w:t>. NO "panza plana".</w:t>
+        <w:t xml:space="preserve"> terror→esperanza (fe con respeto).</w:t>
       </w:r>
     </w:p>
     <w:p>
@@ -832,39 +540,11 @@
         <w:rPr>
           <w:b/>
         </w:rPr>
-        <w:t>Emoción:</w:t>
-      </w:r>
-      <w:r>
-        <w:t xml:space="preserve"> desesperación/terror → esperanza redentora (fe como capa de tono, con respeto).</w:t>
-      </w:r>
-    </w:p>
-    <w:p>
-      <w:pPr>
-        <w:pStyle w:val="ListBullet"/>
-      </w:pPr>
-      <w:r>
-        <w:rPr>
-          <w:b/>
-        </w:rPr>
-        <w:t>Miedo dominante:</w:t>
-      </w:r>
-      <w:r>
-        <w:t xml:space="preserve"> mortal. </w:t>
-      </w:r>
-      <w:r>
-        <w:rPr>
-          <w:b/>
-        </w:rPr>
         <w:t>Objeción raíz:</w:t>
       </w:r>
       <w:r>
-        <w:t xml:space="preserve"> seguridad ("¿me hará daño? ¿choca con mi estatina?"), NO precio ni fraude.</w:t>
+        <w:t xml:space="preserve"> seguridad ("¿me hará daño?/¿choca con mi estatina?"). </w:t>
       </w:r>
-    </w:p>
-    <w:p>
-      <w:pPr>
-        <w:pStyle w:val="ListBullet"/>
-      </w:pPr>
       <w:r>
         <w:rPr>
           <w:b/>
@@ -872,25 +552,16 @@
         <w:t>Mecanismo:</w:t>
       </w:r>
       <w:r>
-        <w:t xml:space="preserve"> "limpiar el hígado" (folk nativo) + bilis/alcachofa (explicación honesta). </w:t>
+        <w:t xml:space="preserve"> "limpiar el hígado" + bilis/alcachofa; </w:t>
       </w:r>
       <w:r>
         <w:rPr>
           <w:b/>
         </w:rPr>
-        <w:t>Prohibido "detox".</w:t>
+        <w:t>prohibido "detox"</w:t>
       </w:r>
       <w:r>
-        <w:t xml:space="preserve"> El puente hinchazón→hígado </w:t>
-      </w:r>
-      <w:r>
-        <w:rPr>
-          <w:b/>
-        </w:rPr>
-        <w:t>NO tiene respaldo clínico</w:t>
-      </w:r>
-      <w:r>
-        <w:t xml:space="preserve"> → framear como testimonio, riesgo de compliance.</w:t>
+        <w:t>; el puente hinchazón→hígado sin respaldo clínico → testimonio.</w:t>
       </w:r>
     </w:p>
     <w:p>
@@ -904,7 +575,38 @@
         <w:t>Prueba:</w:t>
       </w:r>
       <w:r>
-        <w:t xml:space="preserve"> ultrasonido limpio + kilos + cifra (enzimas = blindaje US, no gancho MX).</w:t>
+        <w:t xml:space="preserve"> ultrasonido limpio + kilos. </w:t>
+      </w:r>
+      <w:r>
+        <w:rPr>
+          <w:b/>
+        </w:rPr>
+        <w:t>Villano:</w:t>
+      </w:r>
+      <w:r>
+        <w:t xml:space="preserve"> frituras/azúcar + el DIY casero.</w:t>
+      </w:r>
+    </w:p>
+    <w:p>
+      <w:r>
+        <w:t xml:space="preserve">Es un </w:t>
+      </w:r>
+      <w:r>
+        <w:rPr>
+          <w:b/>
+        </w:rPr>
+        <w:t>ejemplo de ejecución</w:t>
+      </w:r>
+      <w:r>
+        <w:t xml:space="preserve"> que probó el motor, no parte del motor generalizado.</w:t>
+      </w:r>
+    </w:p>
+    <w:p>
+      <w:pPr>
+        <w:pStyle w:val="Heading2"/>
+      </w:pPr>
+      <w:r>
+        <w:t>7. Cómo continuar</w:t>
       </w:r>
     </w:p>
     <w:p>
@@ -915,19 +617,38 @@
         <w:rPr>
           <w:b/>
         </w:rPr>
-        <w:t>Villano:</w:t>
+        <w:t>Producto nuevo:</w:t>
       </w:r>
       <w:r>
-        <w:t xml:space="preserve"> frituras/azúcar + el </w:t>
+        <w:t xml:space="preserve"> correr </w:t>
       </w:r>
       <w:r>
         <w:rPr>
           <w:b/>
         </w:rPr>
-        <w:t>DIY casero</w:t>
+        <w:t>`/voc-research`</w:t>
       </w:r>
       <w:r>
-        <w:t xml:space="preserve"> que odian mantener → las gotas = el atajo.</w:t>
+        <w:t xml:space="preserve"> (pipeline F0-F6 del spec v4.0) → produce docs 14-21 + B0/B1 + 10 → </w:t>
+      </w:r>
+      <w:r>
+        <w:rPr>
+          <w:b/>
+        </w:rPr>
+        <w:t>`/master-spine`</w:t>
+      </w:r>
+      <w:r>
+        <w:t xml:space="preserve"> consolida el doc 00 y emite el </w:t>
+      </w:r>
+      <w:r>
+        <w:rPr>
+          <w:rFonts w:ascii="Consolas" w:hAnsi="Consolas"/>
+          <w:color w:val="C03030"/>
+        </w:rPr>
+        <w:t>spine.json</w:t>
+      </w:r>
+      <w:r>
+        <w:t xml:space="preserve"> → entra al Motor de Creativos.</w:t>
       </w:r>
     </w:p>
     <w:p>
@@ -938,18 +659,19 @@
         <w:rPr>
           <w:b/>
         </w:rPr>
-        <w:t>Arbitraje:</w:t>
+        <w:t>Setup pendiente del v4</w:t>
       </w:r>
       <w:r>
-        <w:t xml:space="preserve"> el DR de hígado/intestino está dominado por marcas EN/EU; ES-MX casi vacío.</w:t>
+        <w:t xml:space="preserve"> (ver spec §6): conectar </w:t>
       </w:r>
-    </w:p>
-    <w:p>
-      <w:pPr>
-        <w:pStyle w:val="Heading2"/>
-      </w:pPr>
       <w:r>
-        <w:t>6. Integraciones (secretos FUERA del repo)</w:t>
+        <w:rPr>
+          <w:b/>
+        </w:rPr>
+        <w:t>MCP Apify</w:t>
+      </w:r>
+      <w:r>
+        <w:t xml:space="preserve"> (requerido para F2). Brave Search opcional.</w:t>
       </w:r>
     </w:p>
     <w:p>
@@ -960,19 +682,27 @@
         <w:rPr>
           <w:b/>
         </w:rPr>
-        <w:t>Apify</w:t>
+        <w:t>90/95%:</w:t>
       </w:r>
       <w:r>
-        <w:t xml:space="preserve"> (scraping VoC, plan Scale) y </w:t>
+        <w:t xml:space="preserve"> la oferta/pricing quedó </w:t>
       </w:r>
       <w:r>
         <w:rPr>
           <w:b/>
         </w:rPr>
-        <w:t>TrendTrack</w:t>
+        <w:t>fuera</w:t>
       </w:r>
       <w:r>
-        <w:t xml:space="preserve"> (competidores/ads) por API.</w:t>
+        <w:t xml:space="preserve"> del research (SOP-MKT-04).</w:t>
+      </w:r>
+    </w:p>
+    <w:p>
+      <w:pPr>
+        <w:pStyle w:val="Heading2"/>
+      </w:pPr>
+      <w:r>
+        <w:t>8. Seguridad / GitHub</w:t>
       </w:r>
     </w:p>
     <w:p>
@@ -980,26 +710,7 @@
         <w:pStyle w:val="ListBullet"/>
       </w:pPr>
       <w:r>
-        <w:t xml:space="preserve">Tokens en </w:t>
-      </w:r>
-      <w:r>
-        <w:rPr>
-          <w:rFonts w:ascii="Consolas" w:hAnsi="Consolas"/>
-          <w:color w:val="C03030"/>
-        </w:rPr>
-        <w:t>C:\Users\Thomas\research_secrets.env</w:t>
-      </w:r>
-      <w:r>
-        <w:t xml:space="preserve"> — </w:t>
-      </w:r>
-      <w:r>
-        <w:rPr>
-          <w:b/>
-        </w:rPr>
-        <w:t>FUERA del repo, nunca commiteados</w:t>
-      </w:r>
-      <w:r>
-        <w:t xml:space="preserve"> (</w:t>
+        <w:t>Tokens (</w:t>
       </w:r>
       <w:r>
         <w:rPr>
@@ -1026,7 +737,76 @@
           <w:rFonts w:ascii="Consolas" w:hAnsi="Consolas"/>
           <w:color w:val="C03030"/>
         </w:rPr>
+        <w:t>FOREPLAY_TOKEN</w:t>
+      </w:r>
+      <w:r>
+        <w:t xml:space="preserve">, </w:t>
+      </w:r>
+      <w:r>
+        <w:rPr>
+          <w:rFonts w:ascii="Consolas" w:hAnsi="Consolas"/>
+          <w:color w:val="C03030"/>
+        </w:rPr>
+        <w:t>GETHOOKD_TOKEN</w:t>
+      </w:r>
+      <w:r>
+        <w:t xml:space="preserve">, </w:t>
+      </w:r>
+      <w:r>
+        <w:rPr>
+          <w:rFonts w:ascii="Consolas" w:hAnsi="Consolas"/>
+          <w:color w:val="C03030"/>
+        </w:rPr>
         <w:t>GITHUB_TOKEN</w:t>
+      </w:r>
+      <w:r>
+        <w:t xml:space="preserve">) en </w:t>
+      </w:r>
+      <w:r>
+        <w:rPr>
+          <w:rFonts w:ascii="Consolas" w:hAnsi="Consolas"/>
+          <w:color w:val="C03030"/>
+        </w:rPr>
+        <w:t>C:\Users\Thomas\research_secrets.env</w:t>
+      </w:r>
+      <w:r>
+        <w:t xml:space="preserve"> — </w:t>
+      </w:r>
+      <w:r>
+        <w:rPr>
+          <w:b/>
+        </w:rPr>
+        <w:t>fuera del repo</w:t>
+      </w:r>
+      <w:r>
+        <w:t>, nunca commiteados (</w:t>
+      </w:r>
+      <w:r>
+        <w:rPr>
+          <w:rFonts w:ascii="Consolas" w:hAnsi="Consolas"/>
+          <w:color w:val="C03030"/>
+        </w:rPr>
+        <w:t>.gitignore</w:t>
+      </w:r>
+      <w:r>
+        <w:t xml:space="preserve"> protege </w:t>
+      </w:r>
+      <w:r>
+        <w:rPr>
+          <w:rFonts w:ascii="Consolas" w:hAnsi="Consolas"/>
+          <w:color w:val="C03030"/>
+        </w:rPr>
+        <w:t>*token*</w:t>
+      </w:r>
+      <w:r>
+        <w:t>/</w:t>
+      </w:r>
+      <w:r>
+        <w:rPr>
+          <w:rFonts w:ascii="Consolas" w:hAnsi="Consolas"/>
+          <w:color w:val="C03030"/>
+        </w:rPr>
+        <w:t>*.env</w:t>
       </w:r>
       <w:r>
         <w:t>).</w:t>
@@ -1037,13 +817,7 @@
         <w:pStyle w:val="ListBullet"/>
       </w:pPr>
       <w:r>
-        <w:rPr>
-          <w:b/>
-        </w:rPr>
-        <w:t>GitHub:</w:t>
-      </w:r>
-      <w:r>
-        <w:t xml:space="preserve"> repo privado </w:t>
+        <w:t xml:space="preserve">Repo privado </w:t>
       </w:r>
       <w:r>
         <w:rPr>
@@ -1053,196 +827,12 @@
         <w:t>github.com/EcomThomas/motor-research-dtc</w:t>
       </w:r>
       <w:r>
-        <w:t>. Nota: el auto-mode bloquea el push automático (exfiltración) → el push lo corre el usuario.</w:t>
-      </w:r>
-    </w:p>
-    <w:p>
-      <w:pPr>
-        <w:pStyle w:val="Heading2"/>
-      </w:pPr>
-      <w:r>
-        <w:t>7. Cómo continuar (próximos pasos)</w:t>
-      </w:r>
-    </w:p>
-    <w:p>
-      <w:pPr>
-        <w:pStyle w:val="ListNumber"/>
-      </w:pPr>
-      <w:r>
-        <w:rPr>
-          <w:b/>
-        </w:rPr>
-        <w:t>Validar el avatar-hinchazón</w:t>
-      </w:r>
-      <w:r>
-        <w:t xml:space="preserve"> (~4 citas) con scraping dirigido antes de gastar presupuesto en la cabeza de playa.</w:t>
-      </w:r>
-    </w:p>
-    <w:p>
-      <w:pPr>
-        <w:pStyle w:val="ListNumber"/>
-      </w:pPr>
-      <w:r>
-        <w:rPr>
-          <w:b/>
-        </w:rPr>
-        <w:t>Compliance</w:t>
-      </w:r>
-      <w:r>
-        <w:t xml:space="preserve"> del puente hinchazón→hígado antes de escalar pauta pagada.</w:t>
-      </w:r>
-    </w:p>
-    <w:p>
-      <w:pPr>
-        <w:pStyle w:val="ListNumber"/>
-      </w:pPr>
-      <w:r>
-        <w:rPr>
-          <w:b/>
-        </w:rPr>
-        <w:t>Advertoriales / copy largo</w:t>
-      </w:r>
-      <w:r>
-        <w:t xml:space="preserve"> desde </w:t>
-      </w:r>
-      <w:r>
-        <w:rPr>
-          <w:rFonts w:ascii="Consolas" w:hAnsi="Consolas"/>
-          <w:color w:val="C03030"/>
-        </w:rPr>
-        <w:t>DOC 21b</w:t>
-      </w:r>
-      <w:r>
-        <w:t xml:space="preserve"> (alineados al Spine v3.2, no al v3).</w:t>
-      </w:r>
-    </w:p>
-    <w:p>
-      <w:pPr>
-        <w:pStyle w:val="ListNumber"/>
-      </w:pPr>
-      <w:r>
-        <w:rPr>
-          <w:b/>
-        </w:rPr>
-        <w:t>Deuda técnica:</w:t>
-      </w:r>
-      <w:r>
-        <w:t xml:space="preserve"> migrar las citas de los docs v3 a EV-IDs (los IDs ya existen).</w:t>
-      </w:r>
-    </w:p>
-    <w:p>
-      <w:pPr>
-        <w:pStyle w:val="ListNumber"/>
-      </w:pPr>
-      <w:r>
-        <w:rPr>
-          <w:b/>
-        </w:rPr>
-        <w:t>Correr el motor v3.3 en un 2º producto</w:t>
-      </w:r>
-      <w:r>
-        <w:t xml:space="preserve"> siguiendo </w:t>
-      </w:r>
-      <w:r>
-        <w:rPr>
-          <w:rFonts w:ascii="Consolas" w:hAnsi="Consolas"/>
-          <w:color w:val="C03030"/>
-        </w:rPr>
-        <w:t>v3.1/README</w:t>
-      </w:r>
-      <w:r>
-        <w:t xml:space="preserve"> (con la doble vía desde el inicio).</w:t>
-      </w:r>
-    </w:p>
-    <w:p>
-      <w:pPr>
-        <w:pStyle w:val="Heading2"/>
-      </w:pPr>
-      <w:r>
-        <w:t>8. Cómo se ejecuta el motor (resumen técnico)</w:t>
-      </w:r>
-    </w:p>
-    <w:p>
-      <w:r>
-        <w:rPr>
-          <w:rFonts w:ascii="Consolas" w:hAnsi="Consolas"/>
-          <w:color w:val="C03030"/>
-        </w:rPr>
-        <w:t>`</w:t>
-      </w:r>
-    </w:p>
-    <w:p>
-      <w:r>
-        <w:t>Fase 0-3   Intake → scraping por pools (Apify) → ingesta (v31_foundation.py) →</w:t>
-      </w:r>
-    </w:p>
-    <w:p>
-      <w:r>
-        <w:t xml:space="preserve">           PI transparente + DATA QUALITY + DOC 14 (v31_docs.py)</w:t>
-      </w:r>
-    </w:p>
-    <w:p>
-      <w:r>
-        <w:t>Fase 4-6   [v3.3] bancos VoC por elemento → doble vía (deep research ‖ VoC) → contraste</w:t>
-      </w:r>
-    </w:p>
-    <w:p>
-      <w:r>
-        <w:t>Fase 7-8   RECONCILIATION → Spine reconciliado al final → validadores (validate_v31.py)</w:t>
-      </w:r>
-    </w:p>
-    <w:p>
-      <w:r>
-        <w:t>Fase 9     Producción (hooks/advertoriales) alineada al Spine</w:t>
-      </w:r>
-    </w:p>
-    <w:p>
-      <w:r>
-        <w:rPr>
-          <w:rFonts w:ascii="Consolas" w:hAnsi="Consolas"/>
-          <w:color w:val="C03030"/>
-        </w:rPr>
-        <w:t>`</w:t>
-      </w:r>
-    </w:p>
-    <w:p>
-      <w:r>
-        <w:t xml:space="preserve">Detalle generalizado en </w:t>
-      </w:r>
-      <w:r>
-        <w:rPr>
-          <w:rFonts w:ascii="Consolas" w:hAnsi="Consolas"/>
-          <w:color w:val="C03030"/>
-        </w:rPr>
-        <w:t>v3.1/MOTOR DE RESEARCH v3.1 — Spec Operativo.md</w:t>
-      </w:r>
-      <w:r>
-        <w:t xml:space="preserve"> + </w:t>
-      </w:r>
-      <w:r>
-        <w:rPr>
-          <w:rFonts w:ascii="Consolas" w:hAnsi="Consolas"/>
-          <w:color w:val="C03030"/>
-        </w:rPr>
-        <w:t>v3.3 — Adenda</w:t>
-      </w:r>
-      <w:r>
-        <w:t xml:space="preserve"> + </w:t>
-      </w:r>
-      <w:r>
-        <w:rPr>
-          <w:rFonts w:ascii="Consolas" w:hAnsi="Consolas"/>
-          <w:color w:val="C03030"/>
-        </w:rPr>
-        <w:t>README</w:t>
-      </w:r>
-      <w:r>
         <w:t>.</w:t>
       </w:r>
     </w:p>
     <w:p>
       <w:r>
-        <w:t>*Handoff v3.3. Compliance queda fuera de alcance a propósito. El corpus crudo (raw/) y los tokens NO están en el repo por diseño.*</w:t>
+        <w:t>*Handoff v4.0. La oferta queda fuera del research (SOP-MKT-04). El corpus crudo y los tokens NO están en el repo por diseño.*</w:t>
       </w:r>
     </w:p>
     <w:sectPr>

</xml_diff>